<commit_message>
h2_1.02; model re-running hell; retros and projections
</commit_message>
<xml_diff>
--- a/assessment/risk_tables/h1_modls_output.docx
+++ b/assessment/risk_tables/h1_modls_output.docx
@@ -119,7 +119,7 @@
                 </m:e>
                 <m:sub>
                   <m:r>
-                    <m:t>2021</m:t>
+                    <m:t>2022</m:t>
                   </m:r>
                 </m:sub>
               </m:sSub>
@@ -146,7 +146,7 @@
                 </m:e>
                 <m:sub>
                   <m:r>
-                    <m:t>2023</m:t>
+                    <m:t>2024</m:t>
                   </m:r>
                 </m:sub>
               </m:sSub>
@@ -176,7 +176,7 @@
                 </m:e>
                 <m:sub>
                   <m:r>
-                    <m:t>2023</m:t>
+                    <m:t>2024</m:t>
                   </m:r>
                 </m:sub>
               </m:sSub>
@@ -235,7 +235,7 @@
                 </m:e>
                 <m:sub>
                   <m:r>
-                    <m:t>2027</m:t>
+                    <m:t>2028</m:t>
                   </m:r>
                 </m:sub>
               </m:sSub>
@@ -265,7 +265,7 @@
                 </m:e>
                 <m:sub>
                   <m:r>
-                    <m:t>2027</m:t>
+                    <m:t>2028</m:t>
                   </m:r>
                 </m:sub>
               </m:sSub>
@@ -324,7 +324,7 @@
                 </m:e>
                 <m:sub>
                   <m:r>
-                    <m:t>2031</m:t>
+                    <m:t>2032</m:t>
                   </m:r>
                 </m:sub>
               </m:sSub>
@@ -354,7 +354,7 @@
                 </m:e>
                 <m:sub>
                   <m:r>
-                    <m:t>2031</m:t>
+                    <m:t>2032</m:t>
                   </m:r>
                 </m:sub>
               </m:sSub>
@@ -405,23 +405,23 @@
               <w:jc w:val="center"/>
             </w:pPr>
             <w:r>
-              <w:t xml:space="preserve">Catch 2022 (kt)</w:t>
-            </w:r>
-          </w:p>
-        </w:tc>
-        <w:tc>
-          <w:tcPr/>
-          <w:p>
-            <w:pPr>
-              <w:numPr>
-                <w:ilvl w:val="0"/>
-                <w:numId w:val="1000"/>
-              </w:numPr>
-              <w:pStyle w:val="Compact"/>
-              <w:jc w:val="center"/>
-            </w:pPr>
-            <w:r>
               <w:t xml:space="preserve">Catch 2023 (kt)</w:t>
+            </w:r>
+          </w:p>
+        </w:tc>
+        <w:tc>
+          <w:tcPr/>
+          <w:p>
+            <w:pPr>
+              <w:numPr>
+                <w:ilvl w:val="0"/>
+                <w:numId w:val="1000"/>
+              </w:numPr>
+              <w:pStyle w:val="Compact"/>
+              <w:jc w:val="center"/>
+            </w:pPr>
+            <w:r>
+              <w:t xml:space="preserve">Catch 2024 (kt)</w:t>
             </w:r>
           </w:p>
         </w:tc>
@@ -455,7 +455,7 @@
               <w:jc w:val="center"/>
             </w:pPr>
             <w:r>
-              <w:t xml:space="preserve">12675</w:t>
+              <w:t xml:space="preserve">16447</w:t>
             </w:r>
           </w:p>
         </w:tc>
@@ -487,7 +487,7 @@
               <w:jc w:val="center"/>
             </w:pPr>
             <w:r>
-              <w:t xml:space="preserve">15884</w:t>
+              <w:t xml:space="preserve">17978</w:t>
             </w:r>
           </w:p>
         </w:tc>
@@ -519,7 +519,7 @@
               <w:jc w:val="center"/>
             </w:pPr>
             <w:r>
-              <w:t xml:space="preserve">15594</w:t>
+              <w:t xml:space="preserve">17868</w:t>
             </w:r>
           </w:p>
         </w:tc>
@@ -601,7 +601,7 @@
               <w:jc w:val="center"/>
             </w:pPr>
             <w:r>
-              <w:t xml:space="preserve">10191</w:t>
+              <w:t xml:space="preserve">10568</w:t>
             </w:r>
           </w:p>
         </w:tc>
@@ -633,87 +633,87 @@
               <w:jc w:val="center"/>
             </w:pPr>
             <w:r>
-              <w:t xml:space="preserve">7669</w:t>
-            </w:r>
-          </w:p>
-        </w:tc>
-        <w:tc>
-          <w:tcPr/>
-          <w:p>
-            <w:pPr>
-              <w:numPr>
-                <w:ilvl w:val="0"/>
-                <w:numId w:val="1000"/>
-              </w:numPr>
-              <w:pStyle w:val="Compact"/>
-              <w:jc w:val="center"/>
-            </w:pPr>
-            <w:r>
-              <w:t xml:space="preserve">96</w:t>
-            </w:r>
-          </w:p>
-        </w:tc>
-        <w:tc>
-          <w:tcPr/>
-          <w:p>
-            <w:pPr>
-              <w:numPr>
-                <w:ilvl w:val="0"/>
-                <w:numId w:val="1000"/>
-              </w:numPr>
-              <w:pStyle w:val="Compact"/>
-              <w:jc w:val="center"/>
-            </w:pPr>
-            <w:r>
-              <w:t xml:space="preserve">5925</w:t>
-            </w:r>
-          </w:p>
-        </w:tc>
-        <w:tc>
-          <w:tcPr/>
-          <w:p>
-            <w:pPr>
-              <w:numPr>
-                <w:ilvl w:val="0"/>
-                <w:numId w:val="1000"/>
-              </w:numPr>
-              <w:pStyle w:val="Compact"/>
-              <w:jc w:val="center"/>
-            </w:pPr>
-            <w:r>
-              <w:t xml:space="preserve">63</w:t>
-            </w:r>
-          </w:p>
-        </w:tc>
-        <w:tc>
-          <w:tcPr/>
-          <w:p>
-            <w:pPr>
-              <w:numPr>
-                <w:ilvl w:val="0"/>
-                <w:numId w:val="1000"/>
-              </w:numPr>
-              <w:pStyle w:val="Compact"/>
-              <w:jc w:val="center"/>
-            </w:pPr>
-            <w:r>
-              <w:t xml:space="preserve">1654</w:t>
-            </w:r>
-          </w:p>
-        </w:tc>
-        <w:tc>
-          <w:tcPr/>
-          <w:p>
-            <w:pPr>
-              <w:numPr>
-                <w:ilvl w:val="0"/>
-                <w:numId w:val="1000"/>
-              </w:numPr>
-              <w:pStyle w:val="Compact"/>
-              <w:jc w:val="center"/>
-            </w:pPr>
-            <w:r>
-              <w:t xml:space="preserve">1911</w:t>
+              <w:t xml:space="preserve">6908</w:t>
+            </w:r>
+          </w:p>
+        </w:tc>
+        <w:tc>
+          <w:tcPr/>
+          <w:p>
+            <w:pPr>
+              <w:numPr>
+                <w:ilvl w:val="0"/>
+                <w:numId w:val="1000"/>
+              </w:numPr>
+              <w:pStyle w:val="Compact"/>
+              <w:jc w:val="center"/>
+            </w:pPr>
+            <w:r>
+              <w:t xml:space="preserve">76</w:t>
+            </w:r>
+          </w:p>
+        </w:tc>
+        <w:tc>
+          <w:tcPr/>
+          <w:p>
+            <w:pPr>
+              <w:numPr>
+                <w:ilvl w:val="0"/>
+                <w:numId w:val="1000"/>
+              </w:numPr>
+              <w:pStyle w:val="Compact"/>
+              <w:jc w:val="center"/>
+            </w:pPr>
+            <w:r>
+              <w:t xml:space="preserve">6112</w:t>
+            </w:r>
+          </w:p>
+        </w:tc>
+        <w:tc>
+          <w:tcPr/>
+          <w:p>
+            <w:pPr>
+              <w:numPr>
+                <w:ilvl w:val="0"/>
+                <w:numId w:val="1000"/>
+              </w:numPr>
+              <w:pStyle w:val="Compact"/>
+              <w:jc w:val="center"/>
+            </w:pPr>
+            <w:r>
+              <w:t xml:space="preserve">62</w:t>
+            </w:r>
+          </w:p>
+        </w:tc>
+        <w:tc>
+          <w:tcPr/>
+          <w:p>
+            <w:pPr>
+              <w:numPr>
+                <w:ilvl w:val="0"/>
+                <w:numId w:val="1000"/>
+              </w:numPr>
+              <w:pStyle w:val="Compact"/>
+              <w:jc w:val="center"/>
+            </w:pPr>
+            <w:r>
+              <w:t xml:space="preserve">3120</w:t>
+            </w:r>
+          </w:p>
+        </w:tc>
+        <w:tc>
+          <w:tcPr/>
+          <w:p>
+            <w:pPr>
+              <w:numPr>
+                <w:ilvl w:val="0"/>
+                <w:numId w:val="1000"/>
+              </w:numPr>
+              <w:pStyle w:val="Compact"/>
+              <w:jc w:val="center"/>
+            </w:pPr>
+            <w:r>
+              <w:t xml:space="preserve">2659</w:t>
             </w:r>
           </w:p>
         </w:tc>
@@ -747,7 +747,7 @@
               <w:jc w:val="center"/>
             </w:pPr>
             <w:r>
-              <w:t xml:space="preserve">11502</w:t>
+              <w:t xml:space="preserve">14813</w:t>
             </w:r>
           </w:p>
         </w:tc>
@@ -779,7 +779,7 @@
               <w:jc w:val="center"/>
             </w:pPr>
             <w:r>
-              <w:t xml:space="preserve">11282</w:t>
+              <w:t xml:space="preserve">13485</w:t>
             </w:r>
           </w:p>
         </w:tc>
@@ -811,55 +811,55 @@
               <w:jc w:val="center"/>
             </w:pPr>
             <w:r>
-              <w:t xml:space="preserve">9654</w:t>
-            </w:r>
-          </w:p>
-        </w:tc>
-        <w:tc>
-          <w:tcPr/>
-          <w:p>
-            <w:pPr>
-              <w:numPr>
-                <w:ilvl w:val="0"/>
-                <w:numId w:val="1000"/>
-              </w:numPr>
-              <w:pStyle w:val="Compact"/>
-              <w:jc w:val="center"/>
-            </w:pPr>
-            <w:r>
-              <w:t xml:space="preserve">99</w:t>
-            </w:r>
-          </w:p>
-        </w:tc>
-        <w:tc>
-          <w:tcPr/>
-          <w:p>
-            <w:pPr>
-              <w:numPr>
-                <w:ilvl w:val="0"/>
-                <w:numId w:val="1000"/>
-              </w:numPr>
-              <w:pStyle w:val="Compact"/>
-              <w:jc w:val="center"/>
-            </w:pPr>
-            <w:r>
-              <w:t xml:space="preserve">748</w:t>
-            </w:r>
-          </w:p>
-        </w:tc>
-        <w:tc>
-          <w:tcPr/>
-          <w:p>
-            <w:pPr>
-              <w:numPr>
-                <w:ilvl w:val="0"/>
-                <w:numId w:val="1000"/>
-              </w:numPr>
-              <w:pStyle w:val="Compact"/>
-              <w:jc w:val="center"/>
-            </w:pPr>
-            <w:r>
-              <w:t xml:space="preserve">941</w:t>
+              <w:t xml:space="preserve">12541</w:t>
+            </w:r>
+          </w:p>
+        </w:tc>
+        <w:tc>
+          <w:tcPr/>
+          <w:p>
+            <w:pPr>
+              <w:numPr>
+                <w:ilvl w:val="0"/>
+                <w:numId w:val="1000"/>
+              </w:numPr>
+              <w:pStyle w:val="Compact"/>
+              <w:jc w:val="center"/>
+            </w:pPr>
+            <w:r>
+              <w:t xml:space="preserve">98</w:t>
+            </w:r>
+          </w:p>
+        </w:tc>
+        <w:tc>
+          <w:tcPr/>
+          <w:p>
+            <w:pPr>
+              <w:numPr>
+                <w:ilvl w:val="0"/>
+                <w:numId w:val="1000"/>
+              </w:numPr>
+              <w:pStyle w:val="Compact"/>
+              <w:jc w:val="center"/>
+            </w:pPr>
+            <w:r>
+              <w:t xml:space="preserve">764</w:t>
+            </w:r>
+          </w:p>
+        </w:tc>
+        <w:tc>
+          <w:tcPr/>
+          <w:p>
+            <w:pPr>
+              <w:numPr>
+                <w:ilvl w:val="0"/>
+                <w:numId w:val="1000"/>
+              </w:numPr>
+              <w:pStyle w:val="Compact"/>
+              <w:jc w:val="center"/>
+            </w:pPr>
+            <w:r>
+              <w:t xml:space="preserve">844</w:t>
             </w:r>
           </w:p>
         </w:tc>
@@ -893,7 +893,7 @@
               <w:jc w:val="center"/>
             </w:pPr>
             <w:r>
-              <w:t xml:space="preserve">11145</w:t>
+              <w:t xml:space="preserve">14323</w:t>
             </w:r>
           </w:p>
         </w:tc>
@@ -925,87 +925,87 @@
               <w:jc w:val="center"/>
             </w:pPr>
             <w:r>
-              <w:t xml:space="preserve">10156</w:t>
-            </w:r>
-          </w:p>
-        </w:tc>
-        <w:tc>
-          <w:tcPr/>
-          <w:p>
-            <w:pPr>
-              <w:numPr>
-                <w:ilvl w:val="0"/>
-                <w:numId w:val="1000"/>
-              </w:numPr>
-              <w:pStyle w:val="Compact"/>
-              <w:jc w:val="center"/>
-            </w:pPr>
-            <w:r>
-              <w:t xml:space="preserve">100</w:t>
-            </w:r>
-          </w:p>
-        </w:tc>
-        <w:tc>
-          <w:tcPr/>
-          <w:p>
-            <w:pPr>
-              <w:numPr>
-                <w:ilvl w:val="0"/>
-                <w:numId w:val="1000"/>
-              </w:numPr>
-              <w:pStyle w:val="Compact"/>
-              <w:jc w:val="center"/>
-            </w:pPr>
-            <w:r>
-              <w:t xml:space="preserve">8404</w:t>
-            </w:r>
-          </w:p>
-        </w:tc>
-        <w:tc>
-          <w:tcPr/>
-          <w:p>
-            <w:pPr>
-              <w:numPr>
-                <w:ilvl w:val="0"/>
-                <w:numId w:val="1000"/>
-              </w:numPr>
-              <w:pStyle w:val="Compact"/>
-              <w:jc w:val="center"/>
-            </w:pPr>
-            <w:r>
-              <w:t xml:space="preserve">95</w:t>
-            </w:r>
-          </w:p>
-        </w:tc>
-        <w:tc>
-          <w:tcPr/>
-          <w:p>
-            <w:pPr>
-              <w:numPr>
-                <w:ilvl w:val="0"/>
-                <w:numId w:val="1000"/>
-              </w:numPr>
-              <w:pStyle w:val="Compact"/>
-              <w:jc w:val="center"/>
-            </w:pPr>
-            <w:r>
-              <w:t xml:space="preserve">987</w:t>
-            </w:r>
-          </w:p>
-        </w:tc>
-        <w:tc>
-          <w:tcPr/>
-          <w:p>
-            <w:pPr>
-              <w:numPr>
-                <w:ilvl w:val="0"/>
-                <w:numId w:val="1000"/>
-              </w:numPr>
-              <w:pStyle w:val="Compact"/>
-              <w:jc w:val="center"/>
-            </w:pPr>
-            <w:r>
-              <w:t xml:space="preserve">1214</w:t>
+              <w:t xml:space="preserve">12409</w:t>
+            </w:r>
+          </w:p>
+        </w:tc>
+        <w:tc>
+          <w:tcPr/>
+          <w:p>
+            <w:pPr>
+              <w:numPr>
+                <w:ilvl w:val="0"/>
+                <w:numId w:val="1000"/>
+              </w:numPr>
+              <w:pStyle w:val="Compact"/>
+              <w:jc w:val="center"/>
+            </w:pPr>
+            <w:r>
+              <w:t xml:space="preserve">99</w:t>
+            </w:r>
+          </w:p>
+        </w:tc>
+        <w:tc>
+          <w:tcPr/>
+          <w:p>
+            <w:pPr>
+              <w:numPr>
+                <w:ilvl w:val="0"/>
+                <w:numId w:val="1000"/>
+              </w:numPr>
+              <w:pStyle w:val="Compact"/>
+              <w:jc w:val="center"/>
+            </w:pPr>
+            <w:r>
+              <w:t xml:space="preserve">11404</w:t>
+            </w:r>
+          </w:p>
+        </w:tc>
+        <w:tc>
+          <w:tcPr/>
+          <w:p>
+            <w:pPr>
+              <w:numPr>
+                <w:ilvl w:val="0"/>
+                <w:numId w:val="1000"/>
+              </w:numPr>
+              <w:pStyle w:val="Compact"/>
+              <w:jc w:val="center"/>
+            </w:pPr>
+            <w:r>
+              <w:t xml:space="preserve">97</w:t>
+            </w:r>
+          </w:p>
+        </w:tc>
+        <w:tc>
+          <w:tcPr/>
+          <w:p>
+            <w:pPr>
+              <w:numPr>
+                <w:ilvl w:val="0"/>
+                <w:numId w:val="1000"/>
+              </w:numPr>
+              <w:pStyle w:val="Compact"/>
+              <w:jc w:val="center"/>
+            </w:pPr>
+            <w:r>
+              <w:t xml:space="preserve">1006</w:t>
+            </w:r>
+          </w:p>
+        </w:tc>
+        <w:tc>
+          <w:tcPr/>
+          <w:p>
+            <w:pPr>
+              <w:numPr>
+                <w:ilvl w:val="0"/>
+                <w:numId w:val="1000"/>
+              </w:numPr>
+              <w:pStyle w:val="Compact"/>
+              <w:jc w:val="center"/>
+            </w:pPr>
+            <w:r>
+              <w:t xml:space="preserve">1083</w:t>
             </w:r>
           </w:p>
         </w:tc>
@@ -1039,7 +1039,7 @@
               <w:jc w:val="center"/>
             </w:pPr>
             <w:r>
-              <w:t xml:space="preserve">10805</w:t>
+              <w:t xml:space="preserve">13856</w:t>
             </w:r>
           </w:p>
         </w:tc>
@@ -1071,7 +1071,7 @@
               <w:jc w:val="center"/>
             </w:pPr>
             <w:r>
-              <w:t xml:space="preserve">9184</w:t>
+              <w:t xml:space="preserve">11484</w:t>
             </w:r>
           </w:p>
         </w:tc>
@@ -1103,55 +1103,55 @@
               <w:jc w:val="center"/>
             </w:pPr>
             <w:r>
-              <w:t xml:space="preserve">7390</w:t>
-            </w:r>
-          </w:p>
-        </w:tc>
-        <w:tc>
-          <w:tcPr/>
-          <w:p>
-            <w:pPr>
-              <w:numPr>
-                <w:ilvl w:val="0"/>
-                <w:numId w:val="1000"/>
-              </w:numPr>
-              <w:pStyle w:val="Compact"/>
-              <w:jc w:val="center"/>
-            </w:pPr>
-            <w:r>
-              <w:t xml:space="preserve">87</w:t>
-            </w:r>
-          </w:p>
-        </w:tc>
-        <w:tc>
-          <w:tcPr/>
-          <w:p>
-            <w:pPr>
-              <w:numPr>
-                <w:ilvl w:val="0"/>
-                <w:numId w:val="1000"/>
-              </w:numPr>
-              <w:pStyle w:val="Compact"/>
-              <w:jc w:val="center"/>
-            </w:pPr>
-            <w:r>
-              <w:t xml:space="preserve">1220</w:t>
-            </w:r>
-          </w:p>
-        </w:tc>
-        <w:tc>
-          <w:tcPr/>
-          <w:p>
-            <w:pPr>
-              <w:numPr>
-                <w:ilvl w:val="0"/>
-                <w:numId w:val="1000"/>
-              </w:numPr>
-              <w:pStyle w:val="Compact"/>
-              <w:jc w:val="center"/>
-            </w:pPr>
-            <w:r>
-              <w:t xml:space="preserve">1469</w:t>
+              <w:t xml:space="preserve">10462</w:t>
+            </w:r>
+          </w:p>
+        </w:tc>
+        <w:tc>
+          <w:tcPr/>
+          <w:p>
+            <w:pPr>
+              <w:numPr>
+                <w:ilvl w:val="0"/>
+                <w:numId w:val="1000"/>
+              </w:numPr>
+              <w:pStyle w:val="Compact"/>
+              <w:jc w:val="center"/>
+            </w:pPr>
+            <w:r>
+              <w:t xml:space="preserve">95</w:t>
+            </w:r>
+          </w:p>
+        </w:tc>
+        <w:tc>
+          <w:tcPr/>
+          <w:p>
+            <w:pPr>
+              <w:numPr>
+                <w:ilvl w:val="0"/>
+                <w:numId w:val="1000"/>
+              </w:numPr>
+              <w:pStyle w:val="Compact"/>
+              <w:jc w:val="center"/>
+            </w:pPr>
+            <w:r>
+              <w:t xml:space="preserve">1243</w:t>
+            </w:r>
+          </w:p>
+        </w:tc>
+        <w:tc>
+          <w:tcPr/>
+          <w:p>
+            <w:pPr>
+              <w:numPr>
+                <w:ilvl w:val="0"/>
+                <w:numId w:val="1000"/>
+              </w:numPr>
+              <w:pStyle w:val="Compact"/>
+              <w:jc w:val="center"/>
+            </w:pPr>
+            <w:r>
+              <w:t xml:space="preserve">1305</w:t>
             </w:r>
           </w:p>
         </w:tc>

</xml_diff>